<commit_message>
Update manuscript files and attach a new screenshot
Update several manuscript files and attach a new screenshot to the project assets.

Replit-Commit-Author: Agent
Replit-Commit-Session-Id: ed7474f6-eba3-49be-ae95-2623f31fe374
Replit-Commit-Checkpoint-Type: full_checkpoint
Replit-Commit-Event-Id: 85589a29-fad2-454a-b01a-ba537672ebe1
Replit-Commit-Screenshot-Url: https://storage.googleapis.com/screenshot-production-us-central1/9eca0e28-34a0-4418-9f5c-60e618813417/ed7474f6-eba3-49be-ae95-2623f31fe374/gLpUmJT
Replit-Helium-Checkpoint-Created: true
</commit_message>
<xml_diff>
--- a/artifacts/api-server/artifacts/api-server/uploads/assets/12/manuscript_6x9.docx
+++ b/artifacts/api-server/artifacts/api-server/uploads/assets/12/manuscript_6x9.docx
@@ -587,14 +587,14 @@
       </w:r>
     </w:p>
     <w:p>
-      <w:bookmarkStart w:id="90777" w:name="chapter_1"/>
+      <w:bookmarkStart w:id="32236" w:name="chapter_1"/>
       <w:pPr>
         <w:pStyle w:val="Heading1"/>
       </w:pPr>
       <w:r>
         <w:t>Session 1: The Nature and Necessity of Communion with God</w:t>
       </w:r>
-      <w:bookmarkEnd w:id="90777"/>
+      <w:bookmarkEnd w:id="32236"/>
     </w:p>
     <w:p>
       <w:pPr>
@@ -824,14 +824,14 @@
       </w:r>
     </w:p>
     <w:p>
-      <w:bookmarkStart w:id="49897" w:name="chapter_2"/>
+      <w:bookmarkStart w:id="74553" w:name="chapter_2"/>
       <w:pPr>
         <w:pStyle w:val="Heading1"/>
       </w:pPr>
       <w:r>
         <w:t>Session 2: Communion with the Father in Love</w:t>
       </w:r>
-      <w:bookmarkEnd w:id="49897"/>
+      <w:bookmarkEnd w:id="74553"/>
     </w:p>
     <w:p>
       <w:pPr>
@@ -1061,14 +1061,14 @@
       </w:r>
     </w:p>
     <w:p>
-      <w:bookmarkStart w:id="82840" w:name="chapter_3"/>
+      <w:bookmarkStart w:id="17573" w:name="chapter_3"/>
       <w:pPr>
         <w:pStyle w:val="Heading1"/>
       </w:pPr>
       <w:r>
         <w:t>Session 3: Hindrances and Helps in Receiving the Father’s Love</w:t>
       </w:r>
-      <w:bookmarkEnd w:id="82840"/>
+      <w:bookmarkEnd w:id="17573"/>
     </w:p>
     <w:p>
       <w:pPr>
@@ -1298,14 +1298,14 @@
       </w:r>
     </w:p>
     <w:p>
-      <w:bookmarkStart w:id="33573" w:name="chapter_4"/>
+      <w:bookmarkStart w:id="25757" w:name="chapter_4"/>
       <w:pPr>
         <w:pStyle w:val="Heading1"/>
       </w:pPr>
       <w:r>
         <w:t>Session 4: Communion with the Son in Grace – His Personal Grace Toward Us</w:t>
       </w:r>
-      <w:bookmarkEnd w:id="33573"/>
+      <w:bookmarkEnd w:id="25757"/>
     </w:p>
     <w:p>
       <w:pPr>
@@ -1535,14 +1535,14 @@
       </w:r>
     </w:p>
     <w:p>
-      <w:bookmarkStart w:id="19467" w:name="chapter_5"/>
+      <w:bookmarkStart w:id="57862" w:name="chapter_5"/>
       <w:pPr>
         <w:pStyle w:val="Heading1"/>
       </w:pPr>
       <w:r>
         <w:t>Session 5: Communion with the Son in Grace – His Benefits and Our Responses</w:t>
       </w:r>
-      <w:bookmarkEnd w:id="19467"/>
+      <w:bookmarkEnd w:id="57862"/>
     </w:p>
     <w:p>
       <w:pPr>
@@ -1772,14 +1772,14 @@
       </w:r>
     </w:p>
     <w:p>
-      <w:bookmarkStart w:id="23177" w:name="chapter_6"/>
+      <w:bookmarkStart w:id="24622" w:name="chapter_6"/>
       <w:pPr>
         <w:pStyle w:val="Heading1"/>
       </w:pPr>
       <w:r>
         <w:t>Session 6: Communion with the Holy Spirit in Consolation</w:t>
       </w:r>
-      <w:bookmarkEnd w:id="23177"/>
+      <w:bookmarkEnd w:id="24622"/>
     </w:p>
     <w:p>
       <w:pPr>
@@ -2009,14 +2009,14 @@
       </w:r>
     </w:p>
     <w:p>
-      <w:bookmarkStart w:id="66336" w:name="chapter_7"/>
+      <w:bookmarkStart w:id="68264" w:name="chapter_7"/>
       <w:pPr>
         <w:pStyle w:val="Heading1"/>
       </w:pPr>
       <w:r>
         <w:t>Session 7: The Trinity in Practice – Distinct Communion, One God</w:t>
       </w:r>
-      <w:bookmarkEnd w:id="66336"/>
+      <w:bookmarkEnd w:id="68264"/>
     </w:p>
     <w:p>
       <w:pPr>
@@ -2246,14 +2246,14 @@
       </w:r>
     </w:p>
     <w:p>
-      <w:bookmarkStart w:id="94516" w:name="chapter_8"/>
+      <w:bookmarkStart w:id="77835" w:name="chapter_8"/>
       <w:pPr>
         <w:pStyle w:val="Heading1"/>
       </w:pPr>
       <w:r>
         <w:t>Session 8: Communion Tested – Sin, Suffering, and Spiritual Dryness</w:t>
       </w:r>
-      <w:bookmarkEnd w:id="94516"/>
+      <w:bookmarkEnd w:id="77835"/>
     </w:p>
     <w:p>
       <w:pPr>
@@ -2483,14 +2483,14 @@
       </w:r>
     </w:p>
     <w:p>
-      <w:bookmarkStart w:id="85338" w:name="chapter_9"/>
+      <w:bookmarkStart w:id="58110" w:name="chapter_9"/>
       <w:pPr>
         <w:pStyle w:val="Heading1"/>
       </w:pPr>
       <w:r>
         <w:t>Session 9: Cultivating a Life of Ongoing Communion</w:t>
       </w:r>
-      <w:bookmarkEnd w:id="85338"/>
+      <w:bookmarkEnd w:id="58110"/>
     </w:p>
     <w:p>
       <w:pPr>
@@ -2720,14 +2720,14 @@
       </w:r>
     </w:p>
     <w:p>
-      <w:bookmarkStart w:id="27400" w:name="chapter_10"/>
+      <w:bookmarkStart w:id="30681" w:name="chapter_10"/>
       <w:pPr>
         <w:pStyle w:val="Heading1"/>
       </w:pPr>
       <w:r>
         <w:t>Session 10: Living Toward Glory – Communion Now and Forever</w:t>
       </w:r>
-      <w:bookmarkEnd w:id="27400"/>
+      <w:bookmarkEnd w:id="30681"/>
     </w:p>
     <w:p>
       <w:pPr>

</xml_diff>